<commit_message>
docs(cierre): agregar evaluación de personas proyecto proceso y producto
</commit_message>
<xml_diff>
--- a/4-Cierre/Evaluacion de las 4P.docx
+++ b/4-Cierre/Evaluacion de las 4P.docx
@@ -14,223 +14,817 @@
           <w:b/>
           <w:bCs/>
         </w:rPr>
-        <w:t>Evaluación de las 4P</w:t>
-      </w:r>
-    </w:p>
-    <w:p>
-      <w:pPr>
-        <w:rPr>
-          <w:b/>
-          <w:bCs/>
-        </w:rPr>
-      </w:pPr>
-      <w:r>
-        <w:rPr>
-          <w:b/>
-          <w:bCs/>
-        </w:rPr>
-        <w:t>1. Personas</w:t>
-      </w:r>
-    </w:p>
-    <w:p>
-      <w:pPr>
+        <w:t>EVALUACIÓN DE LAS 4P</w:t>
+      </w:r>
+    </w:p>
+    <w:p>
+      <w:pPr>
+        <w:rPr>
+          <w:b/>
+          <w:bCs/>
+        </w:rPr>
+      </w:pPr>
+      <w:r>
+        <w:rPr>
+          <w:b/>
+          <w:bCs/>
+        </w:rPr>
+        <w:t>Sistema de Gestión para Mercados Municipales</w:t>
+      </w:r>
+    </w:p>
+    <w:p>
+      <w:pPr>
+        <w:pStyle w:val="Prrafodelista"/>
         <w:numPr>
           <w:ilvl w:val="0"/>
-          <w:numId w:val="1"/>
+          <w:numId w:val="5"/>
         </w:numPr>
-      </w:pPr>
-      <w:r>
-        <w:t>El equipo distribuyó las responsabilidades entre investigación, entrenamiento del modelo, desarrollo del sistema, documentación y presentación.</w:t>
-      </w:r>
-    </w:p>
-    <w:p>
-      <w:pPr>
+        <w:rPr>
+          <w:b/>
+          <w:bCs/>
+        </w:rPr>
+      </w:pPr>
+      <w:r>
+        <w:rPr>
+          <w:b/>
+          <w:bCs/>
+        </w:rPr>
+        <w:t xml:space="preserve"> Objetivo</w:t>
+      </w:r>
+    </w:p>
+    <w:p>
+      <w:pPr>
+        <w:ind w:left="360"/>
+        <w:jc w:val="both"/>
+      </w:pPr>
+      <w:r>
+        <w:t>Evaluar los resultados del proyecto considerando cuatro dimensiones: Personas, Proyecto, Proceso y Producto, con el propósito de identificar logros, dificultades y oportunidades de mejora.</w:t>
+      </w:r>
+    </w:p>
+    <w:p>
+      <w:pPr>
+        <w:rPr>
+          <w:b/>
+          <w:bCs/>
+        </w:rPr>
+      </w:pPr>
+    </w:p>
+    <w:p>
+      <w:pPr>
+        <w:pStyle w:val="Prrafodelista"/>
         <w:numPr>
           <w:ilvl w:val="0"/>
-          <w:numId w:val="1"/>
+          <w:numId w:val="5"/>
         </w:numPr>
-      </w:pPr>
-      <w:r>
-        <w:t>Se requirieron conocimientos de Python, visión por computadora, procesamiento de imágenes, OCR y evaluación de modelos.</w:t>
-      </w:r>
-    </w:p>
-    <w:p>
-      <w:pPr>
+        <w:rPr>
+          <w:b/>
+          <w:bCs/>
+        </w:rPr>
+      </w:pPr>
+      <w:r>
+        <w:rPr>
+          <w:b/>
+          <w:bCs/>
+        </w:rPr>
+        <w:t>Personas</w:t>
+      </w:r>
+    </w:p>
+    <w:p>
+      <w:pPr>
+        <w:ind w:firstLine="708"/>
+        <w:rPr>
+          <w:b/>
+          <w:bCs/>
+        </w:rPr>
+      </w:pPr>
+      <w:r>
+        <w:rPr>
+          <w:b/>
+          <w:bCs/>
+        </w:rPr>
+        <w:t xml:space="preserve">2.1 </w:t>
+      </w:r>
+      <w:r>
+        <w:rPr>
+          <w:b/>
+          <w:bCs/>
+        </w:rPr>
+        <w:t>Distribución de la carga laboral</w:t>
+      </w:r>
+    </w:p>
+    <w:p>
+      <w:pPr>
+        <w:ind w:left="708"/>
+        <w:jc w:val="both"/>
+      </w:pPr>
+      <w:r>
+        <w:t>La renuncia de dos desarrolladores redujo la capacidad del equipo y provocó que los integrantes restantes asumieran más tareas.</w:t>
+      </w:r>
+    </w:p>
+    <w:p>
+      <w:pPr>
+        <w:ind w:left="708"/>
+        <w:jc w:val="both"/>
+      </w:pPr>
+      <w:r>
+        <w:t>Evaluación: Con observaciones.</w:t>
+      </w:r>
+    </w:p>
+    <w:p>
+      <w:pPr>
+        <w:ind w:left="708"/>
+        <w:jc w:val="both"/>
+        <w:rPr>
+          <w:b/>
+          <w:bCs/>
+        </w:rPr>
+      </w:pPr>
+      <w:r>
+        <w:t>Mejora: Redistribuir el trabajo según la capacidad real e incorporar reemplazos antes de aceptar nuevas funcionalidades.</w:t>
+      </w:r>
+    </w:p>
+    <w:p>
+      <w:pPr>
+        <w:ind w:firstLine="708"/>
+        <w:rPr>
+          <w:b/>
+          <w:bCs/>
+        </w:rPr>
+      </w:pPr>
+      <w:r>
+        <w:rPr>
+          <w:b/>
+          <w:bCs/>
+        </w:rPr>
+        <w:t>2</w:t>
+      </w:r>
+      <w:r>
+        <w:rPr>
+          <w:b/>
+          <w:bCs/>
+        </w:rPr>
+        <w:t>.2</w:t>
+      </w:r>
+      <w:r>
+        <w:rPr>
+          <w:b/>
+          <w:bCs/>
+        </w:rPr>
+        <w:t xml:space="preserve">  </w:t>
+      </w:r>
+      <w:r>
+        <w:rPr>
+          <w:b/>
+          <w:bCs/>
+        </w:rPr>
+        <w:t xml:space="preserve"> Gestión del conocimiento</w:t>
+      </w:r>
+    </w:p>
+    <w:p>
+      <w:pPr>
+        <w:ind w:left="708"/>
+        <w:jc w:val="both"/>
+      </w:pPr>
+      <w:r>
+        <w:t>Parte del conocimiento técnico estaba concentrado en algunos desarrolladores, lo que dificultó continuar ciertos módulos después de su salida.</w:t>
+      </w:r>
+    </w:p>
+    <w:p>
+      <w:pPr>
+        <w:ind w:left="708"/>
+        <w:jc w:val="both"/>
+      </w:pPr>
+      <w:r>
+        <w:t>Evaluación: Parcialmente satisfactorio.</w:t>
+      </w:r>
+    </w:p>
+    <w:p>
+      <w:pPr>
+        <w:ind w:left="708"/>
+        <w:jc w:val="both"/>
+      </w:pPr>
+      <w:r>
+        <w:t>Mejora: Documentar los módulos, realizar revisiones de código y asignar un responsable secundario por cada funcionalidad crítica.</w:t>
+      </w:r>
+    </w:p>
+    <w:p>
+      <w:pPr>
+        <w:ind w:firstLine="708"/>
+        <w:rPr>
+          <w:b/>
+          <w:bCs/>
+        </w:rPr>
+      </w:pPr>
+      <w:r>
+        <w:rPr>
+          <w:b/>
+          <w:bCs/>
+        </w:rPr>
+        <w:t>2</w:t>
+      </w:r>
+      <w:r>
+        <w:rPr>
+          <w:b/>
+          <w:bCs/>
+        </w:rPr>
+        <w:t>.3 Comunicación con los involucrados</w:t>
+      </w:r>
+    </w:p>
+    <w:p>
+      <w:pPr>
+        <w:ind w:left="708"/>
+        <w:jc w:val="both"/>
+      </w:pPr>
+      <w:r>
+        <w:t>Los informes semanales facilitaron la comunicación, pero el cambio de funcionarios y representantes municipales generó nuevas reuniones, aclaraciones y demoras.</w:t>
+      </w:r>
+    </w:p>
+    <w:p>
+      <w:pPr>
+        <w:ind w:left="708"/>
+        <w:jc w:val="both"/>
+      </w:pPr>
+      <w:r>
+        <w:t>Evaluación: Satisfactorio con observaciones.</w:t>
+      </w:r>
+    </w:p>
+    <w:p>
+      <w:pPr>
+        <w:ind w:left="708"/>
+        <w:jc w:val="both"/>
+        <w:rPr>
+          <w:b/>
+          <w:bCs/>
+        </w:rPr>
+      </w:pPr>
+      <w:r>
+        <w:t>Mejora: Designar representantes estables y preparar material de inducción para nuevos involucrados.</w:t>
+      </w:r>
+    </w:p>
+    <w:p>
+      <w:pPr>
+        <w:pStyle w:val="Prrafodelista"/>
         <w:numPr>
           <w:ilvl w:val="0"/>
-          <w:numId w:val="1"/>
+          <w:numId w:val="5"/>
         </w:numPr>
-      </w:pPr>
-      <w:r>
-        <w:t>La coordinación del equipo permitió integrar los distintos módulos, aunque fue necesario mejorar la comunicación durante los ajustes finales del sistema.</w:t>
-      </w:r>
-    </w:p>
-    <w:p>
-      <w:pPr>
-        <w:rPr>
-          <w:b/>
-          <w:bCs/>
-        </w:rPr>
-      </w:pPr>
-      <w:r>
-        <w:rPr>
-          <w:b/>
-          <w:bCs/>
-        </w:rPr>
-        <w:t>2. Producto</w:t>
-      </w:r>
-    </w:p>
-    <w:p>
-      <w:pPr>
+        <w:rPr>
+          <w:b/>
+          <w:bCs/>
+        </w:rPr>
+      </w:pPr>
+      <w:r>
+        <w:rPr>
+          <w:b/>
+          <w:bCs/>
+        </w:rPr>
+        <w:t>Proyecto</w:t>
+      </w:r>
+    </w:p>
+    <w:p>
+      <w:pPr>
+        <w:ind w:firstLine="708"/>
+        <w:rPr>
+          <w:b/>
+          <w:bCs/>
+        </w:rPr>
+      </w:pPr>
+      <w:r>
+        <w:rPr>
+          <w:b/>
+          <w:bCs/>
+        </w:rPr>
+        <w:t>3</w:t>
+      </w:r>
+      <w:r>
+        <w:rPr>
+          <w:b/>
+          <w:bCs/>
+        </w:rPr>
+        <w:t>.1 Cumplimiento del alcance</w:t>
+      </w:r>
+    </w:p>
+    <w:p>
+      <w:pPr>
+        <w:ind w:left="708"/>
+        <w:jc w:val="both"/>
+      </w:pPr>
+      <w:r>
+        <w:t>Los diez requerimientos funcionales del alcance inicial fueron desarrollados. El módulo adicional de geolocalización quedó parcialmente implementado.</w:t>
+      </w:r>
+    </w:p>
+    <w:p>
+      <w:pPr>
+        <w:ind w:left="708"/>
+        <w:jc w:val="both"/>
+      </w:pPr>
+      <w:r>
+        <w:t>Evaluación: Alcance inicial cumplido; cambio adicional parcialmente cumplido.</w:t>
+      </w:r>
+    </w:p>
+    <w:p>
+      <w:pPr>
+        <w:ind w:left="708"/>
+        <w:jc w:val="both"/>
+        <w:rPr>
+          <w:b/>
+          <w:bCs/>
+        </w:rPr>
+      </w:pPr>
+    </w:p>
+    <w:p>
+      <w:pPr>
+        <w:ind w:firstLine="708"/>
+        <w:rPr>
+          <w:b/>
+          <w:bCs/>
+        </w:rPr>
+      </w:pPr>
+      <w:r>
+        <w:rPr>
+          <w:b/>
+          <w:bCs/>
+        </w:rPr>
+        <w:lastRenderedPageBreak/>
+        <w:t>3</w:t>
+      </w:r>
+      <w:r>
+        <w:rPr>
+          <w:b/>
+          <w:bCs/>
+        </w:rPr>
+        <w:t>.2 Cumplimiento del cronograma</w:t>
+      </w:r>
+    </w:p>
+    <w:p>
+      <w:pPr>
+        <w:ind w:left="708"/>
+        <w:jc w:val="both"/>
+      </w:pPr>
+      <w:r>
+        <w:t>El proyecto presentó retrasos debido a la reducción del equipo, el cambio normativo y la incorporación del módulo de geolocalización.</w:t>
+      </w:r>
+    </w:p>
+    <w:p>
+      <w:pPr>
+        <w:ind w:left="708"/>
+        <w:jc w:val="both"/>
+      </w:pPr>
+      <w:r>
+        <w:t>Evaluación: Cumplimiento parcial.</w:t>
+      </w:r>
+    </w:p>
+    <w:p>
+      <w:pPr>
+        <w:ind w:left="708"/>
+        <w:jc w:val="both"/>
+        <w:rPr>
+          <w:b/>
+          <w:bCs/>
+        </w:rPr>
+      </w:pPr>
+      <w:r>
+        <w:t>Mejora: No aprobar nuevas funcionalidades cuando exista retraso o capacidad insuficiente, sin antes ajustar plazo, recursos o alcance.</w:t>
+      </w:r>
+    </w:p>
+    <w:p>
+      <w:pPr>
+        <w:ind w:firstLine="708"/>
+        <w:rPr>
+          <w:b/>
+          <w:bCs/>
+        </w:rPr>
+      </w:pPr>
+      <w:r>
+        <w:rPr>
+          <w:b/>
+          <w:bCs/>
+        </w:rPr>
+        <w:t>3</w:t>
+      </w:r>
+      <w:r>
+        <w:rPr>
+          <w:b/>
+          <w:bCs/>
+        </w:rPr>
+        <w:t>.3 Cumplimiento del presupuesto</w:t>
+      </w:r>
+    </w:p>
+    <w:p>
+      <w:pPr>
+        <w:ind w:left="708"/>
+        <w:jc w:val="both"/>
+      </w:pPr>
+      <w:r>
+        <w:t>El proyecto se mantuvo dentro del presupuesto máximo de Bs 70.000 mediante el control de gastos y el uso de la reserva de contingencia.</w:t>
+      </w:r>
+    </w:p>
+    <w:p>
+      <w:pPr>
+        <w:ind w:left="708"/>
+        <w:jc w:val="both"/>
+        <w:rPr>
+          <w:b/>
+          <w:bCs/>
+        </w:rPr>
+      </w:pPr>
+      <w:r>
+        <w:t>Evaluación: Satisfactorio</w:t>
+      </w:r>
+      <w:r>
+        <w:rPr>
+          <w:b/>
+          <w:bCs/>
+        </w:rPr>
+        <w:t>.</w:t>
+      </w:r>
+    </w:p>
+    <w:p>
+      <w:pPr>
+        <w:pStyle w:val="Prrafodelista"/>
         <w:numPr>
           <w:ilvl w:val="0"/>
-          <w:numId w:val="2"/>
+          <w:numId w:val="5"/>
         </w:numPr>
-      </w:pPr>
-      <w:r>
-        <w:t>Se desarrolló un MVP funcional capaz de detectar globos, extraer texto japonés, traducirlo al español y reconstruir la página.</w:t>
-      </w:r>
-    </w:p>
-    <w:p>
-      <w:pPr>
+        <w:rPr>
+          <w:b/>
+          <w:bCs/>
+        </w:rPr>
+      </w:pPr>
+      <w:r>
+        <w:rPr>
+          <w:b/>
+          <w:bCs/>
+        </w:rPr>
+        <w:t>Proceso</w:t>
+      </w:r>
+    </w:p>
+    <w:p>
+      <w:pPr>
+        <w:ind w:firstLine="708"/>
+        <w:rPr>
+          <w:b/>
+          <w:bCs/>
+        </w:rPr>
+      </w:pPr>
+      <w:r>
+        <w:rPr>
+          <w:b/>
+          <w:bCs/>
+        </w:rPr>
+        <w:t>4</w:t>
+      </w:r>
+      <w:r>
+        <w:rPr>
+          <w:b/>
+          <w:bCs/>
+        </w:rPr>
+        <w:t>.1 Gestión de cambios</w:t>
+      </w:r>
+    </w:p>
+    <w:p>
+      <w:pPr>
+        <w:ind w:left="708"/>
+        <w:jc w:val="both"/>
+      </w:pPr>
+      <w:r>
+        <w:t>Las solicitudes de geolocalización y adecuación normativa fueron documentadas. Sin embargo, la geolocalización fue aprobada cuando el equipo ya tenía una capacidad limitada.</w:t>
+      </w:r>
+    </w:p>
+    <w:p>
+      <w:pPr>
+        <w:ind w:left="708"/>
+        <w:jc w:val="both"/>
+      </w:pPr>
+      <w:r>
+        <w:t>Evaluación: Formalmente cumplido, pero con una decisión mejorable.</w:t>
+      </w:r>
+    </w:p>
+    <w:p>
+      <w:pPr>
+        <w:ind w:left="708"/>
+        <w:jc w:val="both"/>
+      </w:pPr>
+      <w:r>
+        <w:t>Mejora: Analizar no solo el valor del cambio, sino también el estado real del cronograma y la disponibilidad del equipo.</w:t>
+      </w:r>
+    </w:p>
+    <w:p>
+      <w:pPr>
+        <w:ind w:firstLine="708"/>
+        <w:jc w:val="both"/>
+        <w:rPr>
+          <w:b/>
+          <w:bCs/>
+        </w:rPr>
+      </w:pPr>
+      <w:r>
+        <w:rPr>
+          <w:b/>
+          <w:bCs/>
+        </w:rPr>
+        <w:t>4.</w:t>
+      </w:r>
+      <w:r>
+        <w:rPr>
+          <w:b/>
+          <w:bCs/>
+        </w:rPr>
+        <w:t>2 Gestión de riesgos e incidencias</w:t>
+      </w:r>
+    </w:p>
+    <w:p>
+      <w:pPr>
+        <w:ind w:left="708"/>
+        <w:jc w:val="both"/>
+      </w:pPr>
+      <w:r>
+        <w:t>Los riesgos de renuncia de personal, cambios normativos y nuevos requerimientos habían sido identificados. Cuando ocurrieron, fueron trasladados al Registro de Incidencias.</w:t>
+      </w:r>
+    </w:p>
+    <w:p>
+      <w:pPr>
+        <w:ind w:left="708"/>
+        <w:jc w:val="both"/>
+      </w:pPr>
+      <w:r>
+        <w:t>Evaluación: Satisfactorio con observaciones.</w:t>
+      </w:r>
+    </w:p>
+    <w:p>
+      <w:pPr>
+        <w:ind w:left="708"/>
+        <w:jc w:val="both"/>
+        <w:rPr>
+          <w:b/>
+          <w:bCs/>
+        </w:rPr>
+      </w:pPr>
+      <w:r>
+        <w:t>Mejora: Preparar planes de contingencia más detallados para los riesgos de impacto alto.</w:t>
+      </w:r>
+    </w:p>
+    <w:p>
+      <w:pPr>
+        <w:ind w:firstLine="708"/>
+        <w:jc w:val="both"/>
+        <w:rPr>
+          <w:b/>
+          <w:bCs/>
+        </w:rPr>
+      </w:pPr>
+      <w:r>
+        <w:rPr>
+          <w:b/>
+          <w:bCs/>
+        </w:rPr>
+        <w:t>4</w:t>
+      </w:r>
+      <w:r>
+        <w:rPr>
+          <w:b/>
+          <w:bCs/>
+        </w:rPr>
+        <w:t>.3 Seguimiento y control</w:t>
+      </w:r>
+    </w:p>
+    <w:p>
+      <w:pPr>
+        <w:ind w:left="708"/>
+        <w:jc w:val="both"/>
+      </w:pPr>
+      <w:r>
+        <w:t>Los informes de avance, el tablero KPI y los registros permitieron detectar retrasos, riesgos y cambios durante la ejecución.</w:t>
+      </w:r>
+    </w:p>
+    <w:p>
+      <w:pPr>
+        <w:ind w:left="708"/>
+        <w:jc w:val="both"/>
+      </w:pPr>
+      <w:r>
+        <w:t>Evaluación: Satisfactorio.</w:t>
+      </w:r>
+    </w:p>
+    <w:p>
+      <w:pPr>
+        <w:ind w:left="708"/>
+        <w:jc w:val="both"/>
+        <w:rPr>
+          <w:b/>
+          <w:bCs/>
+        </w:rPr>
+      </w:pPr>
+      <w:r>
+        <w:t>Mejora: Utilizar los resultados del seguimiento como condición para aprobar o postergar nuevos cambios.</w:t>
+      </w:r>
+    </w:p>
+    <w:p>
+      <w:pPr>
+        <w:pStyle w:val="Prrafodelista"/>
         <w:numPr>
           <w:ilvl w:val="0"/>
-          <w:numId w:val="2"/>
+          <w:numId w:val="5"/>
         </w:numPr>
-      </w:pPr>
-      <w:r>
-        <w:t xml:space="preserve">El modelo propio alcanzó una precisión de 94,2 %, un </w:t>
-      </w:r>
-      <w:proofErr w:type="spellStart"/>
-      <w:r>
-        <w:t>recall</w:t>
-      </w:r>
-      <w:proofErr w:type="spellEnd"/>
-      <w:r>
-        <w:t xml:space="preserve"> de 86 % y un mAP50 de 89,2 %.</w:t>
-      </w:r>
-    </w:p>
-    <w:p>
-      <w:pPr>
+        <w:jc w:val="both"/>
+        <w:rPr>
+          <w:b/>
+          <w:bCs/>
+        </w:rPr>
+      </w:pPr>
+      <w:r>
+        <w:rPr>
+          <w:b/>
+          <w:bCs/>
+        </w:rPr>
+        <w:t>Producto</w:t>
+      </w:r>
+    </w:p>
+    <w:p>
+      <w:pPr>
+        <w:ind w:firstLine="708"/>
+        <w:jc w:val="both"/>
+        <w:rPr>
+          <w:b/>
+          <w:bCs/>
+        </w:rPr>
+      </w:pPr>
+      <w:r>
+        <w:rPr>
+          <w:b/>
+          <w:bCs/>
+        </w:rPr>
+        <w:t>5</w:t>
+      </w:r>
+      <w:r>
+        <w:rPr>
+          <w:b/>
+          <w:bCs/>
+        </w:rPr>
+        <w:t>.1 Funcionalidad</w:t>
+      </w:r>
+    </w:p>
+    <w:p>
+      <w:pPr>
+        <w:ind w:left="708"/>
+        <w:jc w:val="both"/>
+      </w:pPr>
+      <w:r>
+        <w:t>El sistema permite gestionar usuarios, mercados, puestos, comerciantes, asignaciones, tarifas, pagos, licencias sanitarias, informes y auditoría.</w:t>
+      </w:r>
+    </w:p>
+    <w:p>
+      <w:pPr>
+        <w:ind w:left="708"/>
+        <w:jc w:val="both"/>
+        <w:rPr>
+          <w:b/>
+          <w:bCs/>
+        </w:rPr>
+      </w:pPr>
+      <w:r>
+        <w:lastRenderedPageBreak/>
+        <w:t>Evaluación: Satisfactorio.</w:t>
+      </w:r>
+    </w:p>
+    <w:p>
+      <w:pPr>
+        <w:ind w:left="708"/>
+        <w:jc w:val="both"/>
+        <w:rPr>
+          <w:b/>
+          <w:bCs/>
+        </w:rPr>
+      </w:pPr>
+      <w:r>
+        <w:rPr>
+          <w:b/>
+          <w:bCs/>
+        </w:rPr>
+        <w:t>5</w:t>
+      </w:r>
+      <w:r>
+        <w:rPr>
+          <w:b/>
+          <w:bCs/>
+        </w:rPr>
+        <w:t>.2 Calidad</w:t>
+      </w:r>
+    </w:p>
+    <w:p>
+      <w:pPr>
+        <w:ind w:left="708"/>
+        <w:jc w:val="both"/>
+      </w:pPr>
+      <w:r>
+        <w:t>Los módulos del alcance inicial fueron probados y no quedaron defectos críticos abiertos. La geolocalización requiere completar su visualización y pruebas finales.</w:t>
+      </w:r>
+    </w:p>
+    <w:p>
+      <w:pPr>
+        <w:ind w:left="708"/>
+        <w:jc w:val="both"/>
+      </w:pPr>
+      <w:r>
+        <w:t>Evaluación: Aprobado con observaciones.</w:t>
+      </w:r>
+    </w:p>
+    <w:p>
+      <w:pPr>
+        <w:ind w:left="708"/>
+        <w:jc w:val="both"/>
+        <w:rPr>
+          <w:b/>
+          <w:bCs/>
+        </w:rPr>
+      </w:pPr>
+      <w:r>
+        <w:rPr>
+          <w:b/>
+          <w:bCs/>
+        </w:rPr>
+        <w:t>5</w:t>
+      </w:r>
+      <w:r>
+        <w:rPr>
+          <w:b/>
+          <w:bCs/>
+        </w:rPr>
+        <w:t>.3 Documentación y mantenibilidad</w:t>
+      </w:r>
+    </w:p>
+    <w:p>
+      <w:pPr>
+        <w:ind w:left="708"/>
+        <w:jc w:val="both"/>
+      </w:pPr>
+      <w:r>
+        <w:t>El código y los documentos fueron almacenados en GitHub. Se entregaron manuales, registros de pruebas y documentación del proyecto.</w:t>
+      </w:r>
+    </w:p>
+    <w:p>
+      <w:pPr>
+        <w:ind w:left="708"/>
+        <w:jc w:val="both"/>
+      </w:pPr>
+      <w:r>
+        <w:t>Evaluación: Satisfactorio con observaciones.</w:t>
+      </w:r>
+    </w:p>
+    <w:p>
+      <w:pPr>
+        <w:ind w:left="708"/>
+        <w:jc w:val="both"/>
+      </w:pPr>
+      <w:r>
+        <w:t>Mejora: Completar la documentación técnica y de usuario correspondiente al módulo de geolocalización.</w:t>
+      </w:r>
+    </w:p>
+    <w:p>
+      <w:pPr>
+        <w:pStyle w:val="Prrafodelista"/>
         <w:numPr>
           <w:ilvl w:val="0"/>
-          <w:numId w:val="2"/>
+          <w:numId w:val="5"/>
         </w:numPr>
-      </w:pPr>
-      <w:r>
-        <w:t>El producto todavía presenta limitaciones en la limpieza de texto, globos irregulares, fondos complejos y traducciones sin contexto narrativo.</w:t>
-      </w:r>
-    </w:p>
-    <w:p>
-      <w:pPr>
-        <w:rPr>
-          <w:b/>
-          <w:bCs/>
-        </w:rPr>
-      </w:pPr>
-      <w:r>
-        <w:rPr>
-          <w:b/>
-          <w:bCs/>
-        </w:rPr>
-        <w:t>3. Proceso</w:t>
-      </w:r>
-    </w:p>
-    <w:p>
-      <w:pPr>
-        <w:numPr>
-          <w:ilvl w:val="0"/>
-          <w:numId w:val="3"/>
-        </w:numPr>
-      </w:pPr>
-      <w:r>
-        <w:t xml:space="preserve">El desarrollo se organizó en etapas: preparación del </w:t>
-      </w:r>
-      <w:proofErr w:type="spellStart"/>
-      <w:r>
-        <w:t>dataset</w:t>
-      </w:r>
-      <w:proofErr w:type="spellEnd"/>
-      <w:r>
-        <w:t>, entrenamiento, validación, integración del OCR, traducción, limpieza, reconstrucción y pruebas.</w:t>
-      </w:r>
-    </w:p>
-    <w:p>
-      <w:pPr>
-        <w:numPr>
-          <w:ilvl w:val="0"/>
-          <w:numId w:val="3"/>
-        </w:numPr>
-      </w:pPr>
-      <w:r>
-        <w:t>Se utilizaron pruebas progresivas con casos favorables y difíciles para detectar errores en cada etapa del pipeline.</w:t>
-      </w:r>
-    </w:p>
-    <w:p>
-      <w:pPr>
-        <w:numPr>
-          <w:ilvl w:val="0"/>
-          <w:numId w:val="3"/>
-        </w:numPr>
-      </w:pPr>
-      <w:r>
-        <w:t>La separación del código en módulos facilitó la identificación de fallos y la incorporación de mejoras sin modificar todo el sistema.</w:t>
-      </w:r>
-    </w:p>
-    <w:p>
-      <w:pPr>
-        <w:rPr>
-          <w:b/>
-          <w:bCs/>
-        </w:rPr>
-      </w:pPr>
-      <w:r>
-        <w:rPr>
-          <w:b/>
-          <w:bCs/>
-        </w:rPr>
-        <w:t>4. Proyecto</w:t>
-      </w:r>
-    </w:p>
-    <w:p>
-      <w:pPr>
-        <w:numPr>
-          <w:ilvl w:val="0"/>
-          <w:numId w:val="4"/>
-        </w:numPr>
-      </w:pPr>
-      <w:r>
-        <w:t xml:space="preserve">El proyecto cumplió con el alcance principal al entregar una aplicación funcional y demostrable mediante una interfaz </w:t>
-      </w:r>
-      <w:proofErr w:type="spellStart"/>
-      <w:r>
-        <w:t>Gradio</w:t>
-      </w:r>
-      <w:proofErr w:type="spellEnd"/>
-      <w:r>
-        <w:t>.</w:t>
-      </w:r>
-    </w:p>
-    <w:p>
-      <w:pPr>
-        <w:numPr>
-          <w:ilvl w:val="0"/>
-          <w:numId w:val="4"/>
-        </w:numPr>
-      </w:pPr>
-      <w:r>
-        <w:t>El uso de transferencia de aprendizaje y YOLOv8n permitió reducir el tiempo de desarrollo y aprovechar adecuadamente los recursos disponibles.</w:t>
-      </w:r>
-    </w:p>
-    <w:p>
-      <w:pPr>
-        <w:numPr>
-          <w:ilvl w:val="0"/>
-          <w:numId w:val="4"/>
-        </w:numPr>
-      </w:pPr>
-      <w:r>
-        <w:t>La principal dificultad fue integrar tecnologías diferentes y lograr que los resultados de una etapa fueran adecuados para la siguiente.</w:t>
+        <w:rPr>
+          <w:b/>
+          <w:bCs/>
+        </w:rPr>
+      </w:pPr>
+      <w:r>
+        <w:rPr>
+          <w:b/>
+          <w:bCs/>
+        </w:rPr>
+        <w:t>Conclusión</w:t>
+      </w:r>
+    </w:p>
+    <w:p>
+      <w:pPr>
+        <w:ind w:left="708"/>
+        <w:jc w:val="both"/>
+      </w:pPr>
+      <w:r>
+        <w:t>La evaluación de las 4P muestra que el proyecto cumplió satisfactoriamente con el alcance inicial del MVP y generó un producto funcional para los mercados Campesino, Central y Entre Ríos.</w:t>
+      </w:r>
+    </w:p>
+    <w:p>
+      <w:pPr>
+        <w:ind w:left="708"/>
+        <w:jc w:val="both"/>
+      </w:pPr>
+      <w:r>
+        <w:t>Las principales dificultades estuvieron relacionadas con la reducción del equipo, el cambio de involucrados y la aprobación de una nueva funcionalidad cuando el proyecto ya presentaba retrasos.</w:t>
+      </w:r>
+    </w:p>
+    <w:p>
+      <w:pPr>
+        <w:ind w:left="708"/>
+        <w:jc w:val="both"/>
+      </w:pPr>
+      <w:r>
+        <w:t>La principal recomendación para futuros proyectos es evaluar la capacidad real del equipo antes de aceptar cambios, fortalecer la transferencia de conocimiento y mantener representantes institucionales estables durante la ejecución.</w:t>
       </w:r>
     </w:p>
     <w:p/>
@@ -396,6 +990,95 @@
     </w:lvl>
   </w:abstractNum>
   <w:abstractNum w:abstractNumId="1" w15:restartNumberingAfterBreak="0">
+    <w:nsid w:val="5FED4C0D"/>
+    <w:multiLevelType w:val="hybridMultilevel"/>
+    <w:tmpl w:val="F76467F4"/>
+    <w:lvl w:ilvl="0" w:tplc="BEF40D0C">
+      <w:start w:val="1"/>
+      <w:numFmt w:val="decimal"/>
+      <w:lvlText w:val="%1."/>
+      <w:lvlJc w:val="left"/>
+      <w:pPr>
+        <w:ind w:left="720" w:hanging="360"/>
+      </w:pPr>
+      <w:rPr>
+        <w:rFonts w:hint="default"/>
+      </w:rPr>
+    </w:lvl>
+    <w:lvl w:ilvl="1" w:tplc="080A0019" w:tentative="1">
+      <w:start w:val="1"/>
+      <w:numFmt w:val="lowerLetter"/>
+      <w:lvlText w:val="%2."/>
+      <w:lvlJc w:val="left"/>
+      <w:pPr>
+        <w:ind w:left="1440" w:hanging="360"/>
+      </w:pPr>
+    </w:lvl>
+    <w:lvl w:ilvl="2" w:tplc="080A001B" w:tentative="1">
+      <w:start w:val="1"/>
+      <w:numFmt w:val="lowerRoman"/>
+      <w:lvlText w:val="%3."/>
+      <w:lvlJc w:val="right"/>
+      <w:pPr>
+        <w:ind w:left="2160" w:hanging="180"/>
+      </w:pPr>
+    </w:lvl>
+    <w:lvl w:ilvl="3" w:tplc="080A000F" w:tentative="1">
+      <w:start w:val="1"/>
+      <w:numFmt w:val="decimal"/>
+      <w:lvlText w:val="%4."/>
+      <w:lvlJc w:val="left"/>
+      <w:pPr>
+        <w:ind w:left="2880" w:hanging="360"/>
+      </w:pPr>
+    </w:lvl>
+    <w:lvl w:ilvl="4" w:tplc="080A0019" w:tentative="1">
+      <w:start w:val="1"/>
+      <w:numFmt w:val="lowerLetter"/>
+      <w:lvlText w:val="%5."/>
+      <w:lvlJc w:val="left"/>
+      <w:pPr>
+        <w:ind w:left="3600" w:hanging="360"/>
+      </w:pPr>
+    </w:lvl>
+    <w:lvl w:ilvl="5" w:tplc="080A001B" w:tentative="1">
+      <w:start w:val="1"/>
+      <w:numFmt w:val="lowerRoman"/>
+      <w:lvlText w:val="%6."/>
+      <w:lvlJc w:val="right"/>
+      <w:pPr>
+        <w:ind w:left="4320" w:hanging="180"/>
+      </w:pPr>
+    </w:lvl>
+    <w:lvl w:ilvl="6" w:tplc="080A000F" w:tentative="1">
+      <w:start w:val="1"/>
+      <w:numFmt w:val="decimal"/>
+      <w:lvlText w:val="%7."/>
+      <w:lvlJc w:val="left"/>
+      <w:pPr>
+        <w:ind w:left="5040" w:hanging="360"/>
+      </w:pPr>
+    </w:lvl>
+    <w:lvl w:ilvl="7" w:tplc="080A0019" w:tentative="1">
+      <w:start w:val="1"/>
+      <w:numFmt w:val="lowerLetter"/>
+      <w:lvlText w:val="%8."/>
+      <w:lvlJc w:val="left"/>
+      <w:pPr>
+        <w:ind w:left="5760" w:hanging="360"/>
+      </w:pPr>
+    </w:lvl>
+    <w:lvl w:ilvl="8" w:tplc="080A001B" w:tentative="1">
+      <w:start w:val="1"/>
+      <w:numFmt w:val="lowerRoman"/>
+      <w:lvlText w:val="%9."/>
+      <w:lvlJc w:val="right"/>
+      <w:pPr>
+        <w:ind w:left="6480" w:hanging="180"/>
+      </w:pPr>
+    </w:lvl>
+  </w:abstractNum>
+  <w:abstractNum w:abstractNumId="2" w15:restartNumberingAfterBreak="0">
     <w:nsid w:val="665065D0"/>
     <w:multiLevelType w:val="multilevel"/>
     <w:tmpl w:val="3A8A1BAC"/>
@@ -544,7 +1227,7 @@
       </w:rPr>
     </w:lvl>
   </w:abstractNum>
-  <w:abstractNum w:abstractNumId="2" w15:restartNumberingAfterBreak="0">
+  <w:abstractNum w:abstractNumId="3" w15:restartNumberingAfterBreak="0">
     <w:nsid w:val="746B0591"/>
     <w:multiLevelType w:val="multilevel"/>
     <w:tmpl w:val="793451CE"/>
@@ -693,7 +1376,7 @@
       </w:rPr>
     </w:lvl>
   </w:abstractNum>
-  <w:abstractNum w:abstractNumId="3" w15:restartNumberingAfterBreak="0">
+  <w:abstractNum w:abstractNumId="4" w15:restartNumberingAfterBreak="0">
     <w:nsid w:val="7FB6419F"/>
     <w:multiLevelType w:val="multilevel"/>
     <w:tmpl w:val="6D7826A2"/>
@@ -846,13 +1529,16 @@
     <w:abstractNumId w:val="0"/>
   </w:num>
   <w:num w:numId="2">
+    <w:abstractNumId w:val="3"/>
+  </w:num>
+  <w:num w:numId="3">
     <w:abstractNumId w:val="2"/>
   </w:num>
-  <w:num w:numId="3">
+  <w:num w:numId="4">
+    <w:abstractNumId w:val="4"/>
+  </w:num>
+  <w:num w:numId="5">
     <w:abstractNumId w:val="1"/>
-  </w:num>
-  <w:num w:numId="4">
-    <w:abstractNumId w:val="3"/>
   </w:num>
 </w:numbering>
 </file>
@@ -1282,6 +1968,17 @@
     <w:semiHidden/>
     <w:unhideWhenUsed/>
   </w:style>
+  <w:style w:type="paragraph" w:styleId="Prrafodelista">
+    <w:name w:val="List Paragraph"/>
+    <w:basedOn w:val="Normal"/>
+    <w:uiPriority w:val="34"/>
+    <w:qFormat/>
+    <w:rsid w:val="00E26F85"/>
+    <w:pPr>
+      <w:ind w:left="720"/>
+      <w:contextualSpacing/>
+    </w:pPr>
+  </w:style>
 </w:styles>
 </file>
 

</xml_diff>